<commit_message>
Add assessment pack: JSU, reflection answer scheme, CQI plan
New lecturer pack (Word + PDF) with CLOs, item-level JSU and CLO x domain
matrix, reflection marking scheme with model answers, assessor reference for
form fields, and CQI KPIs, triggers/actions and report template. Shared docx
helpers extracted; form updated with reflection marks and final-mark formula.

Co-Authored-By: Claude Opus 5.5 <noreply@anthropic.com>
Claude-Session: https://claude.ai/code/session_01Qw7mvWtnG5vyq1HUhqG6WQ
</commit_message>
<xml_diff>
--- a/marismart-pump-animation/docs/MARISMART_Borang_Rekod_Pemeriksaan.docx
+++ b/marismart-pump-animation/docs/MARISMART_Borang_Rekod_Pemeriksaan.docx
@@ -7374,7 +7374,7 @@
                 <w:sz w:val="18"/>
                 <w:szCs w:val="18"/>
               </w:rPr>
-              <w:t xml:space="preserve">KOMPETEN: jumlah ≥ 60, DAN C2 (keselamatan) serta C4 (data) sekurang-kurangnya Tahap 3.</w:t>
+              <w:t xml:space="preserve">KOMPETEN: jumlah rubrik ≥ 60, DAN C2 (keselamatan) serta C4 (data) sekurang-kurangnya Tahap 3.</w:t>
             </w:r>
           </w:p>
           <w:p>
@@ -7394,6 +7394,20 @@
                 <w:szCs w:val="18"/>
               </w:rPr>
               <w:t xml:space="preserve">BELUM KOMPETEN: jika mana-mana syarat di atas tidak dipenuhi. Sebarang tindakan tidak selamat (C2 Tahap 1) menjadikan keputusan BELUM KOMPETEN, tanpa mengira jumlah markah.</w:t>
+            </w:r>
+          </w:p>
+          <w:p>
+            <w:pPr>
+              <w:spacing w:after="60" w:before="40"/>
+            </w:pPr>
+            <w:r>
+              <w:rPr>
+                <w:rFonts w:ascii="Arial" w:cs="Arial" w:eastAsia="Arial" w:hAnsi="Arial"/>
+                <w:color w:val="55606E"/>
+                <w:sz w:val="17"/>
+                <w:szCs w:val="17"/>
+              </w:rPr>
+              <w:t xml:space="preserve">Markah akhir komponen = 0.8 × Jumlah rubrik (/100) + Refleksi (/20). Lihat Pek Penilaian (JSU) untuk butiran.</w:t>
             </w:r>
           </w:p>
           <w:p>
@@ -7508,7 +7522,7 @@
                 <w:sz w:val="18"/>
                 <w:szCs w:val="18"/>
               </w:rPr>
-              <w:t xml:space="preserve">1. Apakah sumber ketidakpastian terbesar dalam bacaan anda, dan bagaimana anda mengawalnya?</w:t>
+              <w:t xml:space="preserve">R1. Apakah sumber ketidakpastian terbesar dalam bacaan anda, dan bagaimana anda mengawalnya? [8 markah]</w:t>
             </w:r>
           </w:p>
         </w:tc>
@@ -7548,7 +7562,7 @@
                 <w:sz w:val="18"/>
                 <w:szCs w:val="18"/>
               </w:rPr>
-              <w:t xml:space="preserve">2. Mengapakah anda tidak boleh menilai bacaan sebagai "normal" tanpa had yang diluluskan?</w:t>
+              <w:t xml:space="preserve">R2. Mengapakah anda tidak boleh menilai bacaan sebagai "normal" tanpa had yang diluluskan? [6 markah]</w:t>
             </w:r>
           </w:p>
         </w:tc>
@@ -7588,7 +7602,7 @@
                 <w:sz w:val="18"/>
                 <w:szCs w:val="18"/>
               </w:rPr>
-              <w:t xml:space="preserve">3. Apakah maklumat yang paling penting untuk disampaikan semasa serahan kepada orang diberi kuasa?</w:t>
+              <w:t xml:space="preserve">R3. Apakah maklumat yang paling penting untuk disampaikan semasa serahan kepada orang diberi kuasa? [6 markah]</w:t>
             </w:r>
           </w:p>
         </w:tc>

</xml_diff>